<commit_message>
Phase 2 submission, Sarvam evaluation, narrated demo video and a 12-slide deck
- docs/Phase2_Submission: the eight Phase 2 sections, built against not yet built
- docs/evaluation: Sarvam translation and explanation tests on synthetic messages
  (112 of 112 translations kept every time; 20 of 20 explanations accepted)
- Demo video re-recorded with the patient's phone, reception check-in and the
  translated messages, narrated with Sarvam Bulbul (script.mjs, narrate.mjs);
  step set-up now happens off camera
- User guide, website, research paper and deck updated for the new features;
  the deck follows the Phase 2 sections

Co-Authored-By: Claude Opus 5.5 <noreply@anthropic.com>
</commit_message>
<xml_diff>
--- a/docs/RAD-SMART_Research_Paper.docx
+++ b/docs/RAD-SMART_Research_Paper.docx
@@ -81,7 +81,7 @@
           <w:b w:val="0"/>
           <w:i w:val="0"/>
         </w:rPr>
-        <w:t xml:space="preserve"> RAD-SMART is an assistive scheduling system with four steps. It predicts each session's machine-minutes, plans the day with a mixed-integer program that cannot break the department's hard rules, tests the plan in a digital twin, and explains changes to staff and patients. Each course gets one standing time slot for its whole duration. When the machine breaks down, the rest of the day is re-planned under the department's own downtime rules. A person approves every change. We evaluated it on two datasets, kept apart: the department's 55 recorded days (October–December 2024), re-planned in a twin calibrated on those records, and synthetic patients, including 12 weeks of courses and two machine breakdowns.</w:t>
+        <w:t xml:space="preserve"> RAD-SMART is an assistive scheduling system with four steps. It predicts each session's machine-minutes, plans the day with a mixed-integer program that cannot break the department's hard rules, tests the plan in a digital twin, and tells patients in their own language, by a translated message and a voice note, through a page on their phone. Each course gets one standing time slot for its whole duration. When the machine breaks down, the rest of the day is re-planned under the department's own downtime rules. A person approves every change. We evaluated it on two datasets, kept apart: the department's 55 recorded days (October–December 2024), re-planned in a twin calibrated on those records, and synthetic patients, including 12 weeks of courses and two machine breakdowns.</w:t>
       </w:r>
     </w:p>
     <w:p>
@@ -97,7 +97,7 @@
           <w:b w:val="0"/>
           <w:i w:val="0"/>
         </w:rPr>
-        <w:t xml:space="preserve"> On the department's own days, the 90th-percentile wait fell from 108.6 to 70.4 minutes (−35%), and the share treated more than an hour late from 22.2% to 5.7%. The busiest days gained most (130 to 70 minutes). Over 12 synthetic weeks with standing slots, the 90th-percentile wait fell from 81.6 to 49.3 minutes (−40%). After a 150-minute breakdown, live re-planning cut the median wait from 104 to 39 minutes, with a new plan in 14 seconds. An independent checker found no broken hard rule. The costs were a later evening, a short delay for one new patient in five and fewer requested times kept.</w:t>
+        <w:t xml:space="preserve"> On the department's own days, the 90th-percentile wait fell from 108.6 to 70.4 minutes (−35%), and the share treated more than an hour late from 22.2% to 5.7%. The busiest days gained most (130 to 70 minutes). Over 12 synthetic weeks with standing slots, the 90th-percentile wait fell from 81.6 to 49.3 minutes (−40%). After a 150-minute breakdown, live re-planning cut the median wait from 104 to 39 minutes, with a new plan in 14 seconds. An independent checker found no broken hard rule. All 112 translated patient messages, in four Indian languages, kept every appointment time. The costs were a later evening, a short delay for one new patient in five and fewer requested times kept.</w:t>
       </w:r>
     </w:p>
     <w:p>
@@ -1303,6 +1303,15 @@
           <w:i w:val="0"/>
         </w:rPr>
         <w:t xml:space="preserve"> button on the patient's visit page, enters the course and approves the proposed slots. The technologist runs the day from a day board that records arrival, room entry and exit, and machine status, and declares breakdowns there.</w:t>
+      </w:r>
+    </w:p>
+    <w:p>
+      <w:r>
+        <w:rPr>
+          <w:b w:val="0"/>
+          <w:i w:val="0"/>
+        </w:rPr>
+        <w:t>Patients are told through a page on their own phone, opened from one private link sent on WhatsApp, with no app and no login. It shows the next treatment times, the department's messages with a voice note, and a QR code that reception scans to check the patient in; four buttons let the patient say they are on the way, late, cannot come, or want another time, and staff decide what to do. After every approval, RAD-SMART drafts a message for each patient affected, from fixed templates in English. Sarvam Translate puts it into the patient's language (Kannada, Malayalam, Hindi or Konkani; Sarvam has no Tulu model, so Tulu speakers get Kannada, which they read) and Sarvam Bulbul reads it aloud; a technologist reviews it and presses send in WhatsApp. A translation is used only if it keeps exactly the clock times of the English text; otherwise the English is sent. On request, Sarvam-105B explains a proposed slot in plain words from the engine's own reasons, and an answer that mentions any time not in the plan is discarded. Only the message text reaches these services, never a name, hospital number or phone number.</w:t>
       </w:r>
     </w:p>
     <w:p>
@@ -3046,7 +3055,29 @@
           <w:b w:val="0"/>
           <w:i w:val="0"/>
         </w:rPr>
-        <w:t>4.5 Costs</w:t>
+        <w:t>4.5 Patient messages</w:t>
+      </w:r>
+    </w:p>
+    <w:p>
+      <w:r>
+        <w:rPr>
+          <w:b w:val="0"/>
+          <w:i w:val="0"/>
+        </w:rPr>
+        <w:t>We tested the language step on synthetic text, with the app's own settings. Seven message templates (a new course, a pelvic course, a new standing time and four breakdown messages), each with four sets of times, were translated into all four languages. All 112 translations kept every time, so none would have fallen back to English; the median was 1.3–2.0 seconds. Translating back into English and comparing with the source (chrF, 0–100) gave medians of 76–80 by language, with the lowest scores on the pelvic message, which native speakers will check first. For 20 synthetic plans, Sarvam-105B gave an explanation the time check accepted every time, with no invented time; 16 stated both arrival times. Back-translation is only a rough check of meaning: native speakers at the department will rate every template before the pilot.</w:t>
+      </w:r>
+    </w:p>
+    <w:p>
+      <w:pPr>
+        <w:pStyle w:val="Heading2"/>
+        <w:keepNext/>
+      </w:pPr>
+      <w:r>
+        <w:rPr>
+          <w:b w:val="0"/>
+          <w:i w:val="0"/>
+        </w:rPr>
+        <w:t>4.6 Costs</w:t>
       </w:r>
     </w:p>
     <w:p>
@@ -3366,6 +3397,36 @@
           <w:i w:val="0"/>
         </w:rPr>
         <w:t xml:space="preserve"> Live sequencing was tested on one machine; two machines were tested only for the three-week capacity forecast.</w:t>
+      </w:r>
+    </w:p>
+    <w:p>
+      <w:pPr>
+        <w:tabs>
+          <w:tab w:pos="340" w:val="left"/>
+        </w:tabs>
+        <w:spacing w:after="40"/>
+        <w:ind w:left="340" w:hanging="255"/>
+      </w:pPr>
+      <w:r>
+        <w:rPr>
+          <w:color w:val="1C5CAB"/>
+        </w:rPr>
+        <w:t>•</w:t>
+        <w:tab/>
+      </w:r>
+      <w:r>
+        <w:rPr>
+          <w:b/>
+          <w:i w:val="0"/>
+        </w:rPr>
+        <w:t>Messages not yet rated by patients.</w:t>
+      </w:r>
+      <w:r>
+        <w:rPr>
+          <w:b w:val="0"/>
+          <w:i w:val="0"/>
+        </w:rPr>
+        <w:t xml:space="preserve"> The translations were checked automatically and by back-translation, not yet by native speakers or patients.</w:t>
       </w:r>
     </w:p>
     <w:p>

</xml_diff>